<commit_message>
add fix for final skripsi revisi 2
</commit_message>
<xml_diff>
--- a/docs/Final-Skripsi - For Upload.docx
+++ b/docs/Final-Skripsi - For Upload.docx
@@ -4012,7 +4012,7 @@
           <w:sz w:val="28"/>
           <w:szCs w:val="28"/>
         </w:rPr>
-        <w:t>2</w:t>
+        <w:t>3</w:t>
       </w:r>
     </w:p>
     <w:p>
@@ -4058,7 +4058,7 @@
         <w:rPr>
           <w:bCs/>
         </w:rPr>
-        <w:t>2</w:t>
+        <w:t>3</w:t>
       </w:r>
     </w:p>
     <w:p>
@@ -4110,7 +4110,7 @@
         <w:rPr>
           <w:bCs/>
         </w:rPr>
-        <w:t>4</w:t>
+        <w:t>5</w:t>
       </w:r>
     </w:p>
     <w:p>
@@ -4164,7 +4164,7 @@
         <w:rPr>
           <w:bCs/>
         </w:rPr>
-        <w:t>4</w:t>
+        <w:t>5</w:t>
       </w:r>
     </w:p>
     <w:p>
@@ -4224,7 +4224,7 @@
         <w:rPr>
           <w:bCs/>
         </w:rPr>
-        <w:t>5</w:t>
+        <w:t>6</w:t>
       </w:r>
     </w:p>
     <w:p>
@@ -4282,7 +4282,7 @@
         <w:rPr>
           <w:bCs/>
         </w:rPr>
-        <w:t>6</w:t>
+        <w:t>7</w:t>
       </w:r>
     </w:p>
     <w:p>
@@ -4340,7 +4340,7 @@
         <w:rPr>
           <w:bCs/>
         </w:rPr>
-        <w:t>7</w:t>
+        <w:t>8</w:t>
       </w:r>
     </w:p>
     <w:p>
@@ -4405,7 +4405,13 @@
         <w:rPr>
           <w:bCs/>
         </w:rPr>
-        <w:t>28</w:t>
+        <w:t>2</w:t>
+      </w:r>
+      <w:r>
+        <w:rPr>
+          <w:bCs/>
+        </w:rPr>
+        <w:t>9</w:t>
       </w:r>
     </w:p>
     <w:p>
@@ -4465,7 +4471,13 @@
         <w:rPr>
           <w:bCs/>
         </w:rPr>
-        <w:t>28</w:t>
+        <w:t>2</w:t>
+      </w:r>
+      <w:r>
+        <w:rPr>
+          <w:bCs/>
+        </w:rPr>
+        <w:t>9</w:t>
       </w:r>
     </w:p>
     <w:p>
@@ -4525,7 +4537,7 @@
         <w:rPr>
           <w:bCs/>
         </w:rPr>
-        <w:t>29</w:t>
+        <w:t>30</w:t>
       </w:r>
     </w:p>
     <w:p>
@@ -4579,7 +4591,7 @@
         <w:rPr>
           <w:bCs/>
         </w:rPr>
-        <w:t>29</w:t>
+        <w:t>30</w:t>
       </w:r>
     </w:p>
     <w:p>
@@ -4645,7 +4657,7 @@
         <w:rPr>
           <w:bCs/>
         </w:rPr>
-        <w:t>0</w:t>
+        <w:t>1</w:t>
       </w:r>
     </w:p>
     <w:p>
@@ -4722,7 +4734,7 @@
         <w:rPr>
           <w:bCs/>
         </w:rPr>
-        <w:t>0</w:t>
+        <w:t>1</w:t>
       </w:r>
     </w:p>
     <w:p>
@@ -4800,7 +4812,7 @@
         <w:rPr>
           <w:bCs/>
         </w:rPr>
-        <w:t>0</w:t>
+        <w:t>1</w:t>
       </w:r>
       <w:r>
         <w:rPr>
@@ -4853,7 +4865,7 @@
         <w:rPr>
           <w:bCs/>
         </w:rPr>
-        <w:t>1</w:t>
+        <w:t>2</w:t>
       </w:r>
     </w:p>
     <w:p>
@@ -4900,7 +4912,7 @@
         <w:rPr>
           <w:bCs/>
         </w:rPr>
-        <w:t>1</w:t>
+        <w:t>2</w:t>
       </w:r>
     </w:p>
     <w:p>
@@ -4947,7 +4959,7 @@
         <w:rPr>
           <w:bCs/>
         </w:rPr>
-        <w:t>2</w:t>
+        <w:t>3</w:t>
       </w:r>
     </w:p>
     <w:p>
@@ -4988,7 +5000,7 @@
         <w:rPr>
           <w:bCs/>
         </w:rPr>
-        <w:t>2</w:t>
+        <w:t>3</w:t>
       </w:r>
     </w:p>
     <w:p>
@@ -5035,7 +5047,13 @@
         <w:rPr>
           <w:bCs/>
         </w:rPr>
-        <w:t>32</w:t>
+        <w:t>3</w:t>
+      </w:r>
+      <w:r>
+        <w:rPr>
+          <w:bCs/>
+        </w:rPr>
+        <w:t>3</w:t>
       </w:r>
     </w:p>
     <w:p>
@@ -5082,7 +5100,7 @@
         <w:rPr>
           <w:bCs/>
         </w:rPr>
-        <w:t>3</w:t>
+        <w:t>4</w:t>
       </w:r>
     </w:p>
     <w:p>
@@ -5129,7 +5147,7 @@
         <w:rPr>
           <w:bCs/>
         </w:rPr>
-        <w:t>3</w:t>
+        <w:t>4</w:t>
       </w:r>
     </w:p>
     <w:p>
@@ -5176,7 +5194,7 @@
         <w:rPr>
           <w:bCs/>
         </w:rPr>
-        <w:t>3</w:t>
+        <w:t>4</w:t>
       </w:r>
     </w:p>
     <w:p>
@@ -5223,7 +5241,7 @@
         <w:rPr>
           <w:bCs/>
         </w:rPr>
-        <w:t>4</w:t>
+        <w:t>5</w:t>
       </w:r>
     </w:p>
     <w:p>
@@ -5258,7 +5276,7 @@
         <w:rPr>
           <w:bCs/>
         </w:rPr>
-        <w:t>4</w:t>
+        <w:t>5</w:t>
       </w:r>
     </w:p>
     <w:p>
@@ -5295,7 +5313,7 @@
           <w:sz w:val="28"/>
           <w:szCs w:val="28"/>
         </w:rPr>
-        <w:t>6</w:t>
+        <w:t>7</w:t>
       </w:r>
     </w:p>
     <w:p>
@@ -5338,7 +5356,7 @@
         <w:rPr>
           <w:bCs/>
         </w:rPr>
-        <w:t>6</w:t>
+        <w:t>7</w:t>
       </w:r>
     </w:p>
     <w:p>
@@ -5368,7 +5386,7 @@
         <w:rPr>
           <w:bCs/>
         </w:rPr>
-        <w:t>6</w:t>
+        <w:t>7</w:t>
       </w:r>
     </w:p>
     <w:p>
@@ -5409,7 +5427,7 @@
         <w:rPr>
           <w:bCs/>
         </w:rPr>
-        <w:t>6</w:t>
+        <w:t>7</w:t>
       </w:r>
     </w:p>
     <w:p>
@@ -5445,7 +5463,7 @@
         <w:rPr>
           <w:bCs/>
         </w:rPr>
-        <w:t>7</w:t>
+        <w:t>8</w:t>
       </w:r>
     </w:p>
     <w:p>
@@ -5474,7 +5492,7 @@
         <w:rPr>
           <w:bCs/>
         </w:rPr>
-        <w:t>8</w:t>
+        <w:t>9</w:t>
       </w:r>
     </w:p>
     <w:p>
@@ -5503,7 +5521,7 @@
         <w:rPr>
           <w:bCs/>
         </w:rPr>
-        <w:t>0</w:t>
+        <w:t>1</w:t>
       </w:r>
     </w:p>
     <w:p>
@@ -5533,7 +5551,7 @@
         <w:rPr>
           <w:bCs/>
         </w:rPr>
-        <w:t>0</w:t>
+        <w:t>1</w:t>
       </w:r>
     </w:p>
     <w:p>
@@ -5562,7 +5580,7 @@
         <w:rPr>
           <w:bCs/>
         </w:rPr>
-        <w:t>1</w:t>
+        <w:t>2</w:t>
       </w:r>
     </w:p>
     <w:p>
@@ -5591,7 +5609,7 @@
         <w:rPr>
           <w:bCs/>
         </w:rPr>
-        <w:t>2</w:t>
+        <w:t>3</w:t>
       </w:r>
     </w:p>
     <w:p>
@@ -5620,7 +5638,7 @@
         <w:rPr>
           <w:bCs/>
         </w:rPr>
-        <w:t>2</w:t>
+        <w:t>3</w:t>
       </w:r>
     </w:p>
     <w:p>
@@ -5649,7 +5667,7 @@
         <w:rPr>
           <w:bCs/>
         </w:rPr>
-        <w:t>3</w:t>
+        <w:t>4</w:t>
       </w:r>
     </w:p>
     <w:p>
@@ -5678,7 +5696,7 @@
         <w:rPr>
           <w:bCs/>
         </w:rPr>
-        <w:t>3</w:t>
+        <w:t>4</w:t>
       </w:r>
     </w:p>
     <w:p>
@@ -5707,7 +5725,7 @@
         <w:rPr>
           <w:bCs/>
         </w:rPr>
-        <w:t>4</w:t>
+        <w:t>5</w:t>
       </w:r>
     </w:p>
     <w:p>
@@ -5779,7 +5797,7 @@
         <w:rPr>
           <w:bCs/>
         </w:rPr>
-        <w:t>8</w:t>
+        <w:t>9</w:t>
       </w:r>
     </w:p>
     <w:p>
@@ -5816,7 +5834,7 @@
           <w:sz w:val="28"/>
           <w:szCs w:val="28"/>
         </w:rPr>
-        <w:t>2</w:t>
+        <w:t>3</w:t>
       </w:r>
     </w:p>
     <w:p>
@@ -5853,7 +5871,7 @@
         <w:rPr>
           <w:bCs/>
         </w:rPr>
-        <w:t>2</w:t>
+        <w:t>3</w:t>
       </w:r>
     </w:p>
     <w:p>
@@ -5883,7 +5901,7 @@
         <w:rPr>
           <w:bCs/>
         </w:rPr>
-        <w:t>2</w:t>
+        <w:t>3</w:t>
       </w:r>
     </w:p>
     <w:p>
@@ -5928,7 +5946,7 @@
           <w:sz w:val="28"/>
           <w:szCs w:val="28"/>
         </w:rPr>
-        <w:t>4</w:t>
+        <w:t>5</w:t>
       </w:r>
     </w:p>
     <w:p>
@@ -5957,7 +5975,7 @@
           <w:sz w:val="28"/>
           <w:szCs w:val="28"/>
         </w:rPr>
-        <w:t>8</w:t>
+        <w:t>9</w:t>
       </w:r>
     </w:p>
     <w:p>
@@ -5986,7 +6004,7 @@
           <w:sz w:val="28"/>
           <w:szCs w:val="28"/>
         </w:rPr>
-        <w:t>7</w:t>
+        <w:t>8</w:t>
       </w:r>
     </w:p>
     <w:p>
@@ -15757,7 +15775,7 @@
       <w:r>
         <w:lastRenderedPageBreak/>
         <w:drawing>
-          <wp:inline distT="0" distB="0" distL="0" distR="0" wp14:anchorId="17207D96" wp14:editId="37AE782B">
+          <wp:inline distT="0" distB="0" distL="0" distR="0" wp14:anchorId="17207D96" wp14:editId="68CA1868">
             <wp:extent cx="4230197" cy="2855577"/>
             <wp:effectExtent l="0" t="0" r="0" b="2540"/>
             <wp:docPr id="729412893" name="Picture 4" descr="A screenshot of a computer&#10;&#10;AI-generated content may be incorrect."/>
@@ -25585,7 +25603,7 @@
       </w:pPr>
       <w:r>
         <w:drawing>
-          <wp:inline distT="0" distB="0" distL="0" distR="0" wp14:anchorId="334F5A5B" wp14:editId="2B7B63C0">
+          <wp:inline distT="0" distB="0" distL="0" distR="0" wp14:anchorId="334F5A5B" wp14:editId="7D6D6509">
             <wp:extent cx="4801943" cy="1580239"/>
             <wp:effectExtent l="0" t="0" r="0" b="1270"/>
             <wp:docPr id="369031080" name="Picture 5" descr="A graph of a graph&#10;&#10;AI-generated content may be incorrect."/>

</xml_diff>